<commit_message>
feat: real data for all layers (Chicago/Seattle fully real; Houston transit only placeholder)
- Real ACS demographics (Census API) for all 3 cities -> genuine equity correlations
- Real EV sub-index from OpenStreetMap charging stations (key-free AFDC fallback;
  developer.nrel.gov unreachable on this network) via new fetch_osm_ev.py
- Chicago & Seattle now 100% measured across transit/walk/bike/EV/demographics
- Regenerated MES, analysis tables, figures, and dashboard screenshots on real data
- Updated draft (md/docx/pdf) + README data-status table and pipeline steps
</commit_message>
<xml_diff>
--- a/report/Chapters_1-3_Draft.docx
+++ b/report/Chapters_1-3_Draft.docx
@@ -125,7 +125,7 @@
         <w:t xml:space="preserve"> </w:t>
       </w:r>
       <w:r>
-        <w:t xml:space="preserve">Seattle). At submission, the</w:t>
+        <w:t xml:space="preserve">Seattle) on</w:t>
       </w:r>
       <w:r>
         <w:t xml:space="preserve"> </w:t>
@@ -135,13 +135,46 @@
           <w:b/>
           <w:bCs/>
         </w:rPr>
-        <w:t xml:space="preserve">walkability</w:t>
-      </w:r>
-      <w:r>
-        <w:t xml:space="preserve"> </w:t>
-      </w:r>
-      <w:r>
-        <w:t xml:space="preserve">(EPA Smart Location Database) and</w:t>
+        <w:t xml:space="preserve">measured open data</w:t>
+      </w:r>
+      <w:r>
+        <w:t xml:space="preserve">: walkability (EPA Smart Location Database),</w:t>
+      </w:r>
+      <w:r>
+        <w:t xml:space="preserve"> </w:t>
+      </w:r>
+      <w:r>
+        <w:t xml:space="preserve">bicycle (OpenStreetMap), EV charging (OpenStreetMap</w:t>
+      </w:r>
+      <w:r>
+        <w:t xml:space="preserve"> </w:t>
+      </w:r>
+      <w:r>
+        <w:rPr>
+          <w:rStyle w:val="VerbatimChar"/>
+        </w:rPr>
+        <w:t xml:space="preserve">amenity=charging_station</w:t>
+      </w:r>
+      <w:r>
+        <w:t xml:space="preserve">),</w:t>
+      </w:r>
+      <w:r>
+        <w:t xml:space="preserve"> </w:t>
+      </w:r>
+      <w:r>
+        <w:t xml:space="preserve">and demographics (Census ACS 5-year 2019–2023) for all three cities, plus</w:t>
+      </w:r>
+      <w:r>
+        <w:t xml:space="preserve"> </w:t>
+      </w:r>
+      <w:r>
+        <w:t xml:space="preserve">transit (GTFS) for Chicago (CTA) and Seattle (King County Metro). The single</w:t>
+      </w:r>
+      <w:r>
+        <w:t xml:space="preserve"> </w:t>
+      </w:r>
+      <w:r>
+        <w:t xml:space="preserve">remaining placeholder is the</w:t>
       </w:r>
       <w:r>
         <w:t xml:space="preserve"> </w:t>
@@ -151,109 +184,55 @@
           <w:b/>
           <w:bCs/>
         </w:rPr>
-        <w:t xml:space="preserve">bicycle</w:t>
-      </w:r>
-      <w:r>
-        <w:t xml:space="preserve"> </w:t>
-      </w:r>
-      <w:r>
-        <w:t xml:space="preserve">(OpenStreetMap) sub-indices use measured open data for all three</w:t>
-      </w:r>
-      <w:r>
-        <w:t xml:space="preserve"> </w:t>
-      </w:r>
-      <w:r>
-        <w:t xml:space="preserve">cities, and the</w:t>
-      </w:r>
-      <w:r>
-        <w:t xml:space="preserve"> </w:t>
-      </w:r>
-      <w:r>
-        <w:rPr>
-          <w:b/>
-          <w:bCs/>
-        </w:rPr>
-        <w:t xml:space="preserve">transit</w:t>
-      </w:r>
-      <w:r>
-        <w:t xml:space="preserve"> </w:t>
-      </w:r>
-      <w:r>
-        <w:t xml:space="preserve">sub-index uses measured GTFS feeds for Chicago</w:t>
-      </w:r>
-      <w:r>
-        <w:t xml:space="preserve"> </w:t>
-      </w:r>
-      <w:r>
-        <w:t xml:space="preserve">(CTA) and Seattle (King County Metro). The Houston transit feed (no key-free</w:t>
-      </w:r>
-      <w:r>
-        <w:t xml:space="preserve"> </w:t>
-      </w:r>
-      <w:r>
-        <w:t xml:space="preserve">endpoint currently available), the</w:t>
-      </w:r>
-      <w:r>
-        <w:t xml:space="preserve"> </w:t>
-      </w:r>
-      <w:r>
-        <w:rPr>
-          <w:b/>
-          <w:bCs/>
-        </w:rPr>
-        <w:t xml:space="preserve">EV-charging</w:t>
-      </w:r>
-      <w:r>
-        <w:t xml:space="preserve"> </w:t>
-      </w:r>
-      <w:r>
-        <w:t xml:space="preserve">layer (NREL AFDC, blocked</w:t>
-      </w:r>
-      <w:r>
-        <w:t xml:space="preserve"> </w:t>
-      </w:r>
-      <w:r>
-        <w:t xml:space="preserve">on the development network), and the</w:t>
-      </w:r>
-      <w:r>
-        <w:t xml:space="preserve"> </w:t>
-      </w:r>
-      <w:r>
-        <w:rPr>
-          <w:b/>
-          <w:bCs/>
-        </w:rPr>
-        <w:t xml:space="preserve">demographic</w:t>
-      </w:r>
-      <w:r>
-        <w:t xml:space="preserve"> </w:t>
-      </w:r>
-      <w:r>
-        <w:t xml:space="preserve">layer (ACS, awaiting a</w:t>
-      </w:r>
-      <w:r>
-        <w:t xml:space="preserve"> </w:t>
-      </w:r>
-      <w:r>
-        <w:t xml:space="preserve">Census API key) are populated through validated fetchers and are temporarily</w:t>
-      </w:r>
-      <w:r>
-        <w:t xml:space="preserve"> </w:t>
-      </w:r>
-      <w:r>
-        <w:t xml:space="preserve">represented by clearly-labelled placeholders for end-to-end testing. Chapter 4</w:t>
-      </w:r>
-      <w:r>
-        <w:t xml:space="preserve"> </w:t>
-      </w:r>
-      <w:r>
-        <w:t xml:space="preserve">(Results) will report substantive findings once all live sources are ingested;</w:t>
-      </w:r>
-      <w:r>
-        <w:t xml:space="preserve"> </w:t>
-      </w:r>
-      <w:r>
-        <w:t xml:space="preserve">no placeholder values are interpreted as findings in this draft.</w:t>
+        <w:t xml:space="preserve">Houston transit</w:t>
+      </w:r>
+      <w:r>
+        <w:t xml:space="preserve"> </w:t>
+      </w:r>
+      <w:r>
+        <w:t xml:space="preserve">layer, for which no key-free</w:t>
+      </w:r>
+      <w:r>
+        <w:t xml:space="preserve"> </w:t>
+      </w:r>
+      <w:r>
+        <w:t xml:space="preserve">GTFS endpoint is currently available (RideMetro requires API registration); it</w:t>
+      </w:r>
+      <w:r>
+        <w:t xml:space="preserve"> </w:t>
+      </w:r>
+      <w:r>
+        <w:t xml:space="preserve">is clearly labelled and excluded from interpretation. Two data caveats are</w:t>
+      </w:r>
+      <w:r>
+        <w:t xml:space="preserve"> </w:t>
+      </w:r>
+      <w:r>
+        <w:t xml:space="preserve">carried forward to Chapter 5: the EV layer uses community-maintained OSM</w:t>
+      </w:r>
+      <w:r>
+        <w:t xml:space="preserve"> </w:t>
+      </w:r>
+      <w:r>
+        <w:t xml:space="preserve">charging points (a lower-bound proxy relative to the authoritative DOE/NREL</w:t>
+      </w:r>
+      <w:r>
+        <w:t xml:space="preserve"> </w:t>
+      </w:r>
+      <w:r>
+        <w:t xml:space="preserve">AFDC inventory, which was unreachable on the development network), and the</w:t>
+      </w:r>
+      <w:r>
+        <w:t xml:space="preserve"> </w:t>
+      </w:r>
+      <w:r>
+        <w:t xml:space="preserve">measures are supply-side throughout. Chapter 4 (Results) is forthcoming; no</w:t>
+      </w:r>
+      <w:r>
+        <w:t xml:space="preserve"> </w:t>
+      </w:r>
+      <w:r>
+        <w:t xml:space="preserve">placeholder values are interpreted as findings in this draft.</w:t>
       </w:r>
     </w:p>
     <w:p>
@@ -3266,7 +3245,58 @@
         <w:t xml:space="preserve"> </w:t>
       </w:r>
       <w:r>
-        <w:t xml:space="preserve">that proximity raises the score). Both are normalized and averaged.</w:t>
+        <w:t xml:space="preserve">that proximity raises the score). Both are normalized and averaged. The</w:t>
+      </w:r>
+      <w:r>
+        <w:t xml:space="preserve"> </w:t>
+      </w:r>
+      <w:r>
+        <w:t xml:space="preserve">authoritative source is the DOE/NREL AFDC inventory (</w:t>
+      </w:r>
+      <w:r>
+        <w:rPr>
+          <w:rStyle w:val="VerbatimChar"/>
+        </w:rPr>
+        <w:t xml:space="preserve">fetch_afdc.py</w:t>
+      </w:r>
+      <w:r>
+        <w:t xml:space="preserve">); where that</w:t>
+      </w:r>
+      <w:r>
+        <w:t xml:space="preserve"> </w:t>
+      </w:r>
+      <w:r>
+        <w:t xml:space="preserve">API is unreachable, the pipeline falls back to OpenStreetMap</w:t>
+      </w:r>
+      <w:r>
+        <w:t xml:space="preserve"> </w:t>
+      </w:r>
+      <w:r>
+        <w:rPr>
+          <w:rStyle w:val="VerbatimChar"/>
+        </w:rPr>
+        <w:t xml:space="preserve">amenity=charging_station</w:t>
+      </w:r>
+      <w:r>
+        <w:t xml:space="preserve"> </w:t>
+      </w:r>
+      <w:r>
+        <w:t xml:space="preserve">points (</w:t>
+      </w:r>
+      <w:r>
+        <w:rPr>
+          <w:rStyle w:val="VerbatimChar"/>
+        </w:rPr>
+        <w:t xml:space="preserve">fetch_osm_ev.py</w:t>
+      </w:r>
+      <w:r>
+        <w:t xml:space="preserve">), a key-free but</w:t>
+      </w:r>
+      <w:r>
+        <w:t xml:space="preserve"> </w:t>
+      </w:r>
+      <w:r>
+        <w:t xml:space="preserve">lower-bound proxy whose completeness limitation is noted in §5.</w:t>
       </w:r>
     </w:p>
     <w:bookmarkEnd w:id="25"/>

</xml_diff>

<commit_message>
feat: Houston transit now real via Mobility Database — all 3 cities 100% real
- Add Mobility Database API support to fetch_gtfs (token exchange -> METRO Houston feed mdb-154)
- Houston transit sub-index now measured; MES + analysis regenerated
- All Phase-1 cities (Chicago, Houston, Seattle) fully real across transit/walk/bike/EV/demographics
- Updated draft (md/docx/pdf), README data-status table, .env.example
- Refreshed dashboard screenshots on real data
</commit_message>
<xml_diff>
--- a/report/Chapters_1-3_Draft.docx
+++ b/report/Chapters_1-3_Draft.docx
@@ -107,25 +107,19 @@
         <w:t xml:space="preserve"> </w:t>
       </w:r>
       <w:r>
-        <w:t xml:space="preserve">literature, and specifies the methodology in full. The data pipeline,</w:t>
-      </w:r>
-      <w:r>
-        <w:t xml:space="preserve"> </w:t>
-      </w:r>
-      <w:r>
-        <w:t xml:space="preserve">Mobility Equity Score (MES) computation, and interactive dashboard are</w:t>
-      </w:r>
-      <w:r>
-        <w:t xml:space="preserve"> </w:t>
-      </w:r>
-      <w:r>
-        <w:t xml:space="preserve">implemented and run end-to-end for the three Phase-1 cities (Chicago, Houston,</w:t>
-      </w:r>
-      <w:r>
-        <w:t xml:space="preserve"> </w:t>
-      </w:r>
-      <w:r>
-        <w:t xml:space="preserve">Seattle) on</w:t>
+        <w:t xml:space="preserve">literature, and specifies the methodology in full. The data pipeline, Mobility</w:t>
+      </w:r>
+      <w:r>
+        <w:t xml:space="preserve"> </w:t>
+      </w:r>
+      <w:r>
+        <w:t xml:space="preserve">Equity Score (MES) computation, and interactive dashboard are implemented and</w:t>
+      </w:r>
+      <w:r>
+        <w:t xml:space="preserve"> </w:t>
+      </w:r>
+      <w:r>
+        <w:t xml:space="preserve">run end-to-end for all three Phase-1 cities (Chicago, Houston, Seattle) on</w:t>
       </w:r>
       <w:r>
         <w:t xml:space="preserve"> </w:t>
@@ -135,16 +129,22 @@
           <w:b/>
           <w:bCs/>
         </w:rPr>
-        <w:t xml:space="preserve">measured open data</w:t>
-      </w:r>
-      <w:r>
-        <w:t xml:space="preserve">: walkability (EPA Smart Location Database),</w:t>
-      </w:r>
-      <w:r>
-        <w:t xml:space="preserve"> </w:t>
-      </w:r>
-      <w:r>
-        <w:t xml:space="preserve">bicycle (OpenStreetMap), EV charging (OpenStreetMap</w:t>
+        <w:t xml:space="preserve">measured open data across every dimension</w:t>
+      </w:r>
+      <w:r>
+        <w:t xml:space="preserve">: transit (GTFS — CTA, METRO</w:t>
+      </w:r>
+      <w:r>
+        <w:t xml:space="preserve"> </w:t>
+      </w:r>
+      <w:r>
+        <w:t xml:space="preserve">Houston, King County Metro), walkability (EPA Smart Location Database), bicycle</w:t>
+      </w:r>
+      <w:r>
+        <w:t xml:space="preserve"> </w:t>
+      </w:r>
+      <w:r>
+        <w:t xml:space="preserve">(OpenStreetMap), EV charging (OpenStreetMap</w:t>
       </w:r>
       <w:r>
         <w:t xml:space="preserve"> </w:t>
@@ -156,83 +156,49 @@
         <w:t xml:space="preserve">amenity=charging_station</w:t>
       </w:r>
       <w:r>
-        <w:t xml:space="preserve">),</w:t>
-      </w:r>
-      <w:r>
-        <w:t xml:space="preserve"> </w:t>
-      </w:r>
-      <w:r>
-        <w:t xml:space="preserve">and demographics (Census ACS 5-year 2019–2023) for all three cities, plus</w:t>
-      </w:r>
-      <w:r>
-        <w:t xml:space="preserve"> </w:t>
-      </w:r>
-      <w:r>
-        <w:t xml:space="preserve">transit (GTFS) for Chicago (CTA) and Seattle (King County Metro). The single</w:t>
-      </w:r>
-      <w:r>
-        <w:t xml:space="preserve"> </w:t>
-      </w:r>
-      <w:r>
-        <w:t xml:space="preserve">remaining placeholder is the</w:t>
-      </w:r>
-      <w:r>
-        <w:t xml:space="preserve"> </w:t>
-      </w:r>
-      <w:r>
-        <w:rPr>
-          <w:b/>
-          <w:bCs/>
-        </w:rPr>
-        <w:t xml:space="preserve">Houston transit</w:t>
-      </w:r>
-      <w:r>
-        <w:t xml:space="preserve"> </w:t>
-      </w:r>
-      <w:r>
-        <w:t xml:space="preserve">layer, for which no key-free</w:t>
-      </w:r>
-      <w:r>
-        <w:t xml:space="preserve"> </w:t>
-      </w:r>
-      <w:r>
-        <w:t xml:space="preserve">GTFS endpoint is currently available (RideMetro requires API registration); it</w:t>
-      </w:r>
-      <w:r>
-        <w:t xml:space="preserve"> </w:t>
-      </w:r>
-      <w:r>
-        <w:t xml:space="preserve">is clearly labelled and excluded from interpretation. Two data caveats are</w:t>
-      </w:r>
-      <w:r>
-        <w:t xml:space="preserve"> </w:t>
-      </w:r>
-      <w:r>
-        <w:t xml:space="preserve">carried forward to Chapter 5: the EV layer uses community-maintained OSM</w:t>
-      </w:r>
-      <w:r>
-        <w:t xml:space="preserve"> </w:t>
-      </w:r>
-      <w:r>
-        <w:t xml:space="preserve">charging points (a lower-bound proxy relative to the authoritative DOE/NREL</w:t>
-      </w:r>
-      <w:r>
-        <w:t xml:space="preserve"> </w:t>
-      </w:r>
-      <w:r>
-        <w:t xml:space="preserve">AFDC inventory, which was unreachable on the development network), and the</w:t>
-      </w:r>
-      <w:r>
-        <w:t xml:space="preserve"> </w:t>
-      </w:r>
-      <w:r>
-        <w:t xml:space="preserve">measures are supply-side throughout. Chapter 4 (Results) is forthcoming; no</w:t>
-      </w:r>
-      <w:r>
-        <w:t xml:space="preserve"> </w:t>
-      </w:r>
-      <w:r>
-        <w:t xml:space="preserve">placeholder values are interpreted as findings in this draft.</w:t>
+        <w:t xml:space="preserve">), and</w:t>
+      </w:r>
+      <w:r>
+        <w:t xml:space="preserve"> </w:t>
+      </w:r>
+      <w:r>
+        <w:t xml:space="preserve">demographics (Census ACS 5-year 2019–2023). One data caveat is carried forward</w:t>
+      </w:r>
+      <w:r>
+        <w:t xml:space="preserve"> </w:t>
+      </w:r>
+      <w:r>
+        <w:t xml:space="preserve">to Chapter 5: the EV layer uses community-maintained OSM charging points (a</w:t>
+      </w:r>
+      <w:r>
+        <w:t xml:space="preserve"> </w:t>
+      </w:r>
+      <w:r>
+        <w:t xml:space="preserve">lower-bound proxy relative to the authoritative DOE/NREL AFDC inventory, which</w:t>
+      </w:r>
+      <w:r>
+        <w:t xml:space="preserve"> </w:t>
+      </w:r>
+      <w:r>
+        <w:t xml:space="preserve">was unreachable on the development network); the measures are also supply-side</w:t>
+      </w:r>
+      <w:r>
+        <w:t xml:space="preserve"> </w:t>
+      </w:r>
+      <w:r>
+        <w:t xml:space="preserve">throughout. Chapter 4 (Results) is forthcoming and will present the substantive</w:t>
+      </w:r>
+      <w:r>
+        <w:t xml:space="preserve"> </w:t>
+      </w:r>
+      <w:r>
+        <w:t xml:space="preserve">findings; the correlation and clustering machinery is already validated on the</w:t>
+      </w:r>
+      <w:r>
+        <w:t xml:space="preserve"> </w:t>
+      </w:r>
+      <w:r>
+        <w:t xml:space="preserve">live data.</w:t>
       </w:r>
     </w:p>
     <w:p>

</xml_diff>